<commit_message>
Updated branch names on meeting 1 notes
</commit_message>
<xml_diff>
--- a/Meeting1_notes.docx
+++ b/Meeting1_notes.docx
@@ -53,13 +53,7 @@
         </w:numPr>
       </w:pPr>
       <w:r>
-        <w:t xml:space="preserve">Implement </w:t>
-      </w:r>
-      <w:r>
-        <w:t>Adapter + Façade</w:t>
-      </w:r>
-      <w:r>
-        <w:t xml:space="preserve"> (Task 2)</w:t>
+        <w:t>Implement Adapter + Façade (Task 2)</w:t>
       </w:r>
     </w:p>
     <w:p>
@@ -116,19 +110,7 @@
         </w:numPr>
       </w:pPr>
       <w:r>
-        <w:t xml:space="preserve">Implement </w:t>
-      </w:r>
-      <w:r>
-        <w:t>State</w:t>
-      </w:r>
-      <w:r>
-        <w:t xml:space="preserve"> + </w:t>
-      </w:r>
-      <w:r>
-        <w:t>Observer</w:t>
-      </w:r>
-      <w:r>
-        <w:t xml:space="preserve"> (Task 2)</w:t>
+        <w:t>Implement State + Observer (Task 2)</w:t>
       </w:r>
     </w:p>
     <w:p>
@@ -191,19 +173,7 @@
         </w:numPr>
       </w:pPr>
       <w:r>
-        <w:t xml:space="preserve">Implement </w:t>
-      </w:r>
-      <w:r>
-        <w:t>Command</w:t>
-      </w:r>
-      <w:r>
-        <w:t xml:space="preserve"> + </w:t>
-      </w:r>
-      <w:r>
-        <w:t>Mediator</w:t>
-      </w:r>
-      <w:r>
-        <w:t xml:space="preserve"> (Task 2)</w:t>
+        <w:t>Implement Command + Mediator (Task 2)</w:t>
       </w:r>
     </w:p>
     <w:p>
@@ -215,13 +185,7 @@
         </w:numPr>
       </w:pPr>
       <w:r>
-        <w:t>Task 3 (</w:t>
-      </w:r>
-      <w:r>
-        <w:t>1</w:t>
-      </w:r>
-      <w:r>
-        <w:t xml:space="preserve"> scenario)</w:t>
+        <w:t>Task 3 (1 scenario)</w:t>
       </w:r>
     </w:p>
     <w:p>
@@ -279,23 +243,7 @@
         </w:numPr>
       </w:pPr>
       <w:r>
-        <w:t xml:space="preserve">Using the old syntax for pointers (e.g. </w:t>
-      </w:r>
-      <w:proofErr w:type="spellStart"/>
-      <w:r>
-        <w:t>MyClass</w:t>
-      </w:r>
-      <w:proofErr w:type="spellEnd"/>
-      <w:r>
-        <w:t xml:space="preserve">* </w:t>
-      </w:r>
-      <w:proofErr w:type="spellStart"/>
-      <w:r>
-        <w:t>obj</w:t>
-      </w:r>
-      <w:proofErr w:type="spellEnd"/>
-      <w:r>
-        <w:t>…)</w:t>
+        <w:t>Using the old syntax for pointers (e.g. MyClass* obj…)</w:t>
       </w:r>
     </w:p>
     <w:p>
@@ -1407,17 +1355,8 @@
                 <w:sz w:val="20"/>
                 <w:szCs w:val="20"/>
               </w:rPr>
-              <w:t>test/</w:t>
+              <w:t>test/tendai</w:t>
             </w:r>
-            <w:proofErr w:type="spellStart"/>
-            <w:r>
-              <w:rPr>
-                <w:sz w:val="20"/>
-                <w:szCs w:val="20"/>
-              </w:rPr>
-              <w:t>tendai</w:t>
-            </w:r>
-            <w:proofErr w:type="spellEnd"/>
           </w:p>
         </w:tc>
         <w:tc>
@@ -1501,17 +1440,8 @@
                 <w:sz w:val="20"/>
                 <w:szCs w:val="20"/>
               </w:rPr>
-              <w:t>test/</w:t>
+              <w:t>test/munashe</w:t>
             </w:r>
-            <w:proofErr w:type="spellStart"/>
-            <w:r>
-              <w:rPr>
-                <w:sz w:val="20"/>
-                <w:szCs w:val="20"/>
-              </w:rPr>
-              <w:t>munashe</w:t>
-            </w:r>
-            <w:proofErr w:type="spellEnd"/>
           </w:p>
         </w:tc>
         <w:tc>
@@ -1595,7 +1525,21 @@
                 <w:sz w:val="20"/>
                 <w:szCs w:val="20"/>
               </w:rPr>
-              <w:t>test/Lesego</w:t>
+              <w:t>test/</w:t>
+            </w:r>
+            <w:r>
+              <w:rPr>
+                <w:sz w:val="20"/>
+                <w:szCs w:val="20"/>
+              </w:rPr>
+              <w:t>l</w:t>
+            </w:r>
+            <w:r>
+              <w:rPr>
+                <w:sz w:val="20"/>
+                <w:szCs w:val="20"/>
+              </w:rPr>
+              <w:t>esego</w:t>
             </w:r>
           </w:p>
         </w:tc>
@@ -2204,17 +2148,8 @@
                 <w:sz w:val="20"/>
                 <w:szCs w:val="20"/>
               </w:rPr>
-              <w:t>feat/</w:t>
+              <w:t>feat/uml</w:t>
             </w:r>
-            <w:proofErr w:type="spellStart"/>
-            <w:r>
-              <w:rPr>
-                <w:sz w:val="20"/>
-                <w:szCs w:val="20"/>
-              </w:rPr>
-              <w:t>uml</w:t>
-            </w:r>
-            <w:proofErr w:type="spellEnd"/>
           </w:p>
         </w:tc>
         <w:tc>
@@ -3156,16 +3091,8 @@
         <w:rPr>
           <w:highlight w:val="lightGray"/>
         </w:rPr>
-        <w:t>feat/</w:t>
-      </w:r>
-      <w:proofErr w:type="spellStart"/>
-      <w:r>
-        <w:rPr>
-          <w:highlight w:val="lightGray"/>
-        </w:rPr>
-        <w:t>uml</w:t>
-      </w:r>
-      <w:proofErr w:type="spellEnd"/>
+        <w:t>feat/uml</w:t>
+      </w:r>
       <w:r>
         <w:t>.</w:t>
       </w:r>
@@ -3184,16 +3111,8 @@
         <w:rPr>
           <w:highlight w:val="lightGray"/>
         </w:rPr>
-        <w:t>feat/</w:t>
-      </w:r>
-      <w:proofErr w:type="spellStart"/>
-      <w:r>
-        <w:rPr>
-          <w:highlight w:val="lightGray"/>
-        </w:rPr>
-        <w:t>uml</w:t>
-      </w:r>
-      <w:proofErr w:type="spellEnd"/>
+        <w:t>feat/uml</w:t>
+      </w:r>
       <w:r>
         <w:t>.</w:t>
       </w:r>
@@ -3212,33 +3131,17 @@
         <w:rPr>
           <w:highlight w:val="lightGray"/>
         </w:rPr>
-        <w:t>feat/</w:t>
-      </w:r>
-      <w:proofErr w:type="spellStart"/>
+        <w:t>feat/uml</w:t>
+      </w:r>
+      <w:r>
+        <w:t xml:space="preserve"> is merged into </w:t>
+      </w:r>
       <w:r>
         <w:rPr>
           <w:highlight w:val="lightGray"/>
         </w:rPr>
-        <w:t>uml</w:t>
-      </w:r>
-      <w:proofErr w:type="spellEnd"/>
-      <w:r>
-        <w:t xml:space="preserve"> is merged into </w:t>
-      </w:r>
-      <w:r>
-        <w:rPr>
-          <w:highlight w:val="lightGray"/>
-        </w:rPr>
-        <w:t>test/</w:t>
-      </w:r>
-      <w:proofErr w:type="spellStart"/>
-      <w:r>
-        <w:rPr>
-          <w:highlight w:val="lightGray"/>
-        </w:rPr>
-        <w:t>tendai</w:t>
-      </w:r>
-      <w:proofErr w:type="spellEnd"/>
+        <w:t>test/tendai</w:t>
+      </w:r>
       <w:r>
         <w:t>.</w:t>
       </w:r>
@@ -3257,16 +3160,8 @@
         <w:rPr>
           <w:highlight w:val="lightGray"/>
         </w:rPr>
-        <w:t>test/</w:t>
-      </w:r>
-      <w:proofErr w:type="spellStart"/>
-      <w:r>
-        <w:rPr>
-          <w:highlight w:val="lightGray"/>
-        </w:rPr>
-        <w:t>tendai</w:t>
-      </w:r>
-      <w:proofErr w:type="spellEnd"/>
+        <w:t>test/tendai</w:t>
+      </w:r>
       <w:r>
         <w:t>.</w:t>
       </w:r>
@@ -3336,24 +3231,13 @@
         <w:rPr>
           <w:highlight w:val="lightGray"/>
         </w:rPr>
-        <w:t>feat/</w:t>
-      </w:r>
-      <w:proofErr w:type="gramStart"/>
-      <w:r>
-        <w:rPr>
-          <w:highlight w:val="lightGray"/>
-        </w:rPr>
-        <w:t xml:space="preserve">* </w:t>
+        <w:t xml:space="preserve">feat/* </w:t>
       </w:r>
       <w:r>
         <w:t xml:space="preserve"> -</w:t>
       </w:r>
       <w:r>
-        <w:t>-</w:t>
-      </w:r>
-      <w:proofErr w:type="gramEnd"/>
-      <w:r>
-        <w:t>&gt;</w:t>
+        <w:t>-&gt;</w:t>
       </w:r>
       <w:r>
         <w:t xml:space="preserve"> </w:t>
@@ -3376,24 +3260,13 @@
         <w:rPr>
           <w:highlight w:val="lightGray"/>
         </w:rPr>
-        <w:t>test/&lt;member</w:t>
-      </w:r>
-      <w:proofErr w:type="gramStart"/>
-      <w:r>
-        <w:rPr>
-          <w:highlight w:val="lightGray"/>
-        </w:rPr>
-        <w:t xml:space="preserve">&gt; </w:t>
+        <w:t xml:space="preserve">test/&lt;member&gt; </w:t>
       </w:r>
       <w:r>
         <w:t xml:space="preserve"> -</w:t>
       </w:r>
       <w:r>
-        <w:t>-</w:t>
-      </w:r>
-      <w:proofErr w:type="gramEnd"/>
-      <w:r>
-        <w:t>&gt;</w:t>
+        <w:t>-&gt;</w:t>
       </w:r>
       <w:r>
         <w:t xml:space="preserve"> </w:t>
@@ -5116,6 +4989,7 @@
   <w:style w:type="character" w:default="1" w:styleId="DefaultParagraphFont">
     <w:name w:val="Default Paragraph Font"/>
     <w:uiPriority w:val="1"/>
+    <w:semiHidden/>
     <w:unhideWhenUsed/>
   </w:style>
   <w:style w:type="table" w:default="1" w:styleId="TableNormal">
@@ -5620,7 +5494,7 @@
     </inkml:brush>
   </inkml:definitions>
   <inkml:trace contextRef="#ctx0" brushRef="#br0">1875 0 24575,'0'1020'0,"1"-1000"0,7 36 0,-4-36 0,1 35 0,-6 28-1365</inkml:trace>
-  <inkml:trace contextRef="#ctx0" brushRef="#br0" timeOffset="2161.24">1825 569 24575,'-66'2'0,"-91"14"0,-64 24 0,75-12 0,64-12 0,30-5 0,-1-2 0,-87 3 0,-715-13 0,853 1 0,0 0 0,0 0 0,0 0 0,0 0 0,0 0 0,0 1 0,0-1 0,0 1 0,0-1 0,0 1 0,0 0 0,0-1 0,0 1 0,0 0 0,1 0 0,-1 1 0,0-1 0,1 0 0,-1 0 0,1 1 0,-3 1 0,3 1 0,-1-1 0,1 0 0,0 1 0,-1-1 0,2 1 0,-1 0 0,0-1 0,1 1 0,-1 0 0,1-1 0,1 6 0,2 578-1365</inkml:trace>
+  <inkml:trace contextRef="#ctx0" brushRef="#br0" timeOffset="2161.23">1825 569 24575,'-66'2'0,"-91"14"0,-64 24 0,75-12 0,64-12 0,30-5 0,-1-2 0,-87 3 0,-715-13 0,853 1 0,0 0 0,0 0 0,0 0 0,0 0 0,0 0 0,0 1 0,0-1 0,0 1 0,0-1 0,0 1 0,0 0 0,0-1 0,0 1 0,0 0 0,1 0 0,-1 1 0,0-1 0,1 0 0,-1 0 0,1 1 0,-3 1 0,3 1 0,-1-1 0,1 0 0,0 1 0,-1-1 0,2 1 0,-1 0 0,0-1 0,1 1 0,-1 0 0,1-1 0,1 6 0,2 578-1365</inkml:trace>
   <inkml:trace contextRef="#ctx0" brushRef="#br0" timeOffset="4611.21">1958 617 24575,'13'1'0,"0"0"0,0 1 0,18 5 0,11 2 0,50 0 0,158-4 0,-151-6 0,-75 2 0,35 7 0,-34-4 0,35 1 0,-40-5 0,12-1 0,0 2 0,0 1 0,0 2 0,36 8 0,-32-5 0,-1-2 0,2-1 0,-1-2 0,62-4 0,-20 0 0,25 1 0,126 3 0,-214 0 0,1 0 0,-1 1 0,20 7 0,-21-6 0,0 0 0,1-1 0,-1 0 0,15 0 0,-11-3 0,-13-1 0,1 1 0,-1 0 0,1 0 0,-1 1 0,9 1 0,-13-1 0,1-1 0,-1 1 0,0 0 0,1-1 0,-1 1 0,0 0 0,1 0 0,-1 0 0,0 0 0,0 0 0,0 0 0,0 0 0,0 0 0,0 0 0,0 0 0,0 1 0,-1-1 0,1 0 0,0 1 0,-1-1 0,1 1 0,-1-1 0,1 0 0,-1 4 0,3 15 0,-2 1 0,-1 0 0,-2 29 0,-1 6 0,5 35 0,-4 85 0,-6-131 0,5-33 0,0 1 0,0 17 0,3-14-1365</inkml:trace>
 </inkml:ink>
 </file>

</xml_diff>